<commit_message>
Days 4 and 5 as one project: Northwind Knowledge Assistant milestones; update capstone docs and README
</commit_message>
<xml_diff>
--- a/capstone/Capstone_Brief.docx
+++ b/capstone/Capstone_Brief.docx
@@ -31,7 +31,7 @@
     </w:p>
     <w:p>
       <w:r>
-        <w:t>In teams of 3 to 4, choose one scenario below (or propose one from your own domain), design the AI solution end to end, and present your architecture and trade-offs. This is a design exercise first: a clear, defensible architecture matters more than code. A small prototype built from our notebooks is optional.</w:t>
+        <w:t>On Days 4 and 5 your team builds the Northwind Knowledge Assistant in five milestones (assistant and tools, MCP, tracking and monitoring, security and explainability, demo and design). That working assistant is your reference implementation. For the capstone, choose one scenario below (or your own domain), adapt the design to it with the canvas, demo what you built and present your architecture and trade-offs. A clear, defensible architecture matters more than extra code.</w:t>
       </w:r>
     </w:p>
     <w:p>
@@ -442,6 +442,15 @@
     </w:p>
     <w:p>
       <w:pPr>
+        <w:pStyle w:val="ListBullet"/>
+        <w:spacing w:after="20"/>
+      </w:pPr>
+      <w:r>
+        <w:t>A short live demo of your assistant (about 2 minutes of your 8).</w:t>
+      </w:r>
+    </w:p>
+    <w:p>
+      <w:pPr>
         <w:pStyle w:val="Heading1"/>
       </w:pPr>
       <w:r>
@@ -510,7 +519,7 @@
                 <w:b/>
                 <w:sz w:val="19"/>
               </w:rPr>
-              <w:t>10 min</w:t>
+              <w:t>Milestone 5</w:t>
             </w:r>
           </w:p>
         </w:tc>
@@ -524,40 +533,7 @@
                 <w:b w:val="0"/>
                 <w:sz w:val="19"/>
               </w:rPr>
-              <w:t>Brief; choose scenario; form teams</w:t>
-            </w:r>
-          </w:p>
-        </w:tc>
-      </w:tr>
-      <w:tr>
-        <w:trPr>
-          <w:cantSplit w:val="true"/>
-        </w:trPr>
-        <w:tc>
-          <w:tcPr>
-            <w:tcW w:type="dxa" w:w="1984"/>
-          </w:tcPr>
-          <w:p>
-            <w:r>
-              <w:rPr>
-                <w:b/>
-                <w:sz w:val="19"/>
-              </w:rPr>
-              <w:t>About 100 min</w:t>
-            </w:r>
-          </w:p>
-        </w:tc>
-        <w:tc>
-          <w:tcPr>
-            <w:tcW w:type="dxa" w:w="7880"/>
-          </w:tcPr>
-          <w:p>
-            <w:r>
-              <w:rPr>
-                <w:b w:val="0"/>
-                <w:sz w:val="19"/>
-              </w:rPr>
-              <w:t>Design with the canvas; draw the architecture; prepare 5 slides at most</w:t>
+              <w:t>Demo your assistant; adapt the design to your scenario with the canvas; draw the architecture; prepare 5 slides at most</w:t>
             </w:r>
           </w:p>
         </w:tc>
@@ -926,7 +902,7 @@
         <w:spacing w:after="20"/>
       </w:pPr>
       <w:r>
-        <w:t>If you build a prototype, reuse the Day 2 to Day 4 notebooks; keep it small.</w:t>
+        <w:t>The demo uses your milestone notebooks; keep it short.</w:t>
       </w:r>
     </w:p>
     <w:p>

</xml_diff>

<commit_message>
Capstone aligned to the Day 5 case study: brief and answer template
</commit_message>
<xml_diff>
--- a/capstone/Capstone_Brief.docx
+++ b/capstone/Capstone_Brief.docx
@@ -9,7 +9,7 @@
           <w:b/>
           <w:sz w:val="48"/>
         </w:rPr>
-        <w:t>Capstone Project: Design an AI Solution</w:t>
+        <w:t>Capstone: Agentic IT Operations Platform</w:t>
       </w:r>
     </w:p>
     <w:p>
@@ -18,7 +18,7 @@
           <w:color w:val="0E7C86"/>
           <w:sz w:val="22"/>
         </w:rPr>
-        <w:t>AI Solution Architect Program  |  Friday 16 October 2026  |  Instructor: Nagarjuna Naidu</w:t>
+        <w:t>AI Solution Architect Program  |  Friday 16 October 2026 afternoon  |  90-minute case study, then presentations</w:t>
       </w:r>
     </w:p>
     <w:p>
@@ -26,12 +26,51 @@
         <w:pStyle w:val="Heading1"/>
       </w:pPr>
       <w:r>
-        <w:t>What you will do</w:t>
+        <w:t>The case</w:t>
       </w:r>
     </w:p>
     <w:p>
       <w:r>
-        <w:t>On Days 4 and 5 your team builds the Northwind Knowledge Assistant in five milestones (assistant and tools, MCP, tracking and monitoring, security and explainability, demo and design). That working assistant is your reference implementation. For the capstone, choose one scenario below (or your own domain), adapt the design to it with the canvas, demo what you built and present your architecture and trade-offs. A clear, defensible architecture matters more than extra code.</w:t>
+        <w:t>A global enterprise wants an Agentic AI-powered IT Operations Platform that can autonomously manage production incidents. The system should: monitor alerts from multiple systems; analyse logs and telemetry; retrieve troubleshooting SOPs; identify probable root causes; execute approved remediation workflows; maintain memory of past incidents; coordinate across multiple specialised AI agents; and interact with enterprise tools using MCP.</w:t>
+      </w:r>
+    </w:p>
+    <w:p>
+      <w:pPr>
+        <w:pStyle w:val="Heading2"/>
+      </w:pPr>
+      <w:r>
+        <w:t>Example scenario</w:t>
+      </w:r>
+    </w:p>
+    <w:p>
+      <w:r>
+        <w:t>A payment application shows high latency, an increased error rate and database timeout exceptions. The platform should: 1 detect the anomaly; 2 gather logs and metrics; 3 retrieve similar historical incidents; 4 generate a root-cause hypothesis; 5 recommend remediation; 6 execute safe automation steps; 7 escalate if confidence is low.</w:t>
+      </w:r>
+    </w:p>
+    <w:p>
+      <w:pPr>
+        <w:pStyle w:val="Heading2"/>
+      </w:pPr>
+      <w:r>
+        <w:t>Expected agents</w:t>
+      </w:r>
+    </w:p>
+    <w:p>
+      <w:r>
+        <w:t>Monitoring Agent, Log Analysis Agent, RAG Retrieval Agent, Decision Agent, Automation Agent, Compliance Agent, Escalation Agent.</w:t>
+      </w:r>
+    </w:p>
+    <w:p>
+      <w:pPr>
+        <w:pStyle w:val="Heading2"/>
+      </w:pPr>
+      <w:r>
+        <w:t>Areas to focus on</w:t>
+      </w:r>
+    </w:p>
+    <w:p>
+      <w:r>
+        <w:t>LLM selection, prompt engineering, vector database, RAG, guardrails, agentic AI, design patterns, short-term memory, long-term memory, MCP. Mention your tech stack based on your knowledge.</w:t>
       </w:r>
     </w:p>
     <w:p>
@@ -39,20 +78,7 @@
         <w:pStyle w:val="Heading1"/>
       </w:pPr>
       <w:r>
-        <w:t>Your building tool: the Architecture Canvas</w:t>
-      </w:r>
-    </w:p>
-    <w:p>
-      <w:r>
-        <w:t>You have been filling the canvas section by section during the week. Use it as the backbone of your design and presentation.</w:t>
-      </w:r>
-    </w:p>
-    <w:p>
-      <w:pPr>
-        <w:pStyle w:val="Heading1"/>
-      </w:pPr>
-      <w:r>
-        <w:t>Choose a scenario</w:t>
+        <w:t>Deliverables and scoring</w:t>
       </w:r>
     </w:p>
     <w:tbl>
@@ -63,10 +89,8 @@
         <w:tblLook w:firstColumn="1" w:firstRow="1" w:lastColumn="0" w:lastRow="0" w:noHBand="0" w:noVBand="1" w:val="04A0"/>
       </w:tblPr>
       <w:tblGrid>
-        <w:gridCol w:w="1928"/>
-        <w:gridCol w:w="3061"/>
-        <w:gridCol w:w="2608"/>
-        <w:gridCol w:w="2268"/>
+        <w:gridCol w:w="7880"/>
+        <w:gridCol w:w="1984"/>
       </w:tblGrid>
       <w:tr>
         <w:trPr>
@@ -74,7 +98,7 @@
         </w:trPr>
         <w:tc>
           <w:tcPr>
-            <w:tcW w:type="dxa" w:w="1928"/>
+            <w:tcW w:type="dxa" w:w="7880"/>
             <w:shd w:val="clear" w:fill="0E7C86"/>
           </w:tcPr>
           <w:p>
@@ -82,15 +106,15 @@
               <w:rPr>
                 <w:b/>
                 <w:color w:val="FFFFFF"/>
-                <w:sz w:val="18"/>
+                <w:sz w:val="19"/>
               </w:rPr>
-              <w:t>Scenario</w:t>
+              <w:t>Deliverable</w:t>
             </w:r>
           </w:p>
         </w:tc>
         <w:tc>
           <w:tcPr>
-            <w:tcW w:type="dxa" w:w="3061"/>
+            <w:tcW w:type="dxa" w:w="1984"/>
             <w:shd w:val="clear" w:fill="0E7C86"/>
           </w:tcPr>
           <w:p>
@@ -98,41 +122,9 @@
               <w:rPr>
                 <w:b/>
                 <w:color w:val="FFFFFF"/>
-                <w:sz w:val="18"/>
+                <w:sz w:val="19"/>
               </w:rPr>
-              <w:t>What it is</w:t>
-            </w:r>
-          </w:p>
-        </w:tc>
-        <w:tc>
-          <w:tcPr>
-            <w:tcW w:type="dxa" w:w="2608"/>
-            <w:shd w:val="clear" w:fill="0E7C86"/>
-          </w:tcPr>
-          <w:p>
-            <w:r>
-              <w:rPr>
-                <w:b/>
-                <w:color w:val="FFFFFF"/>
-                <w:sz w:val="18"/>
-              </w:rPr>
-              <w:t>Constraints</w:t>
-            </w:r>
-          </w:p>
-        </w:tc>
-        <w:tc>
-          <w:tcPr>
-            <w:tcW w:type="dxa" w:w="2268"/>
-            <w:shd w:val="clear" w:fill="0E7C86"/>
-          </w:tcPr>
-          <w:p>
-            <w:r>
-              <w:rPr>
-                <w:b/>
-                <w:color w:val="FFFFFF"/>
-                <w:sz w:val="18"/>
-              </w:rPr>
-              <w:t>KPIs to consider</w:t>
+              <w:t>Weight</w:t>
             </w:r>
           </w:p>
         </w:tc>
@@ -143,57 +135,29 @@
         </w:trPr>
         <w:tc>
           <w:tcPr>
-            <w:tcW w:type="dxa" w:w="1928"/>
+            <w:tcW w:type="dxa" w:w="7880"/>
           </w:tcPr>
           <w:p>
             <w:r>
               <w:rPr>
                 <w:b/>
-                <w:sz w:val="18"/>
+                <w:sz w:val="19"/>
               </w:rPr>
-              <w:t>A  SME loan assistant (bank)</w:t>
+              <w:t>1  End-to-end architecture diagram</w:t>
             </w:r>
           </w:p>
         </w:tc>
         <w:tc>
           <w:tcPr>
-            <w:tcW w:type="dxa" w:w="3061"/>
+            <w:tcW w:type="dxa" w:w="1984"/>
           </w:tcPr>
           <w:p>
             <w:r>
               <w:rPr>
                 <w:b w:val="0"/>
-                <w:sz w:val="18"/>
+                <w:sz w:val="19"/>
               </w:rPr>
-              <w:t>A relationship-manager copilot that answers lending-policy questions from internal documents with citations, and screens loan applications with a default-risk model that can explain its output.</w:t>
-            </w:r>
-          </w:p>
-        </w:tc>
-        <w:tc>
-          <w:tcPr>
-            <w:tcW w:type="dxa" w:w="2608"/>
-          </w:tcPr>
-          <w:p>
-            <w:r>
-              <w:rPr>
-                <w:b w:val="0"/>
-                <w:sz w:val="18"/>
-              </w:rPr>
-              <w:t>Regulated lending (explainable decisions, audit trail, assume customer data must stay in-country); p95 latency under 3 seconds; several thousand documents that change monthly.</w:t>
-            </w:r>
-          </w:p>
-        </w:tc>
-        <w:tc>
-          <w:tcPr>
-            <w:tcW w:type="dxa" w:w="2268"/>
-          </w:tcPr>
-          <w:p>
-            <w:r>
-              <w:rPr>
-                <w:b w:val="0"/>
-                <w:sz w:val="18"/>
-              </w:rPr>
-              <w:t>Time to answer, share of answers with correct citations, risk-model quality in business terms (cost of wrong approvals and rejections), override rate.</w:t>
+              <w:t>50%</w:t>
             </w:r>
           </w:p>
         </w:tc>
@@ -204,57 +168,29 @@
         </w:trPr>
         <w:tc>
           <w:tcPr>
-            <w:tcW w:type="dxa" w:w="1928"/>
+            <w:tcW w:type="dxa" w:w="7880"/>
           </w:tcPr>
           <w:p>
             <w:r>
               <w:rPr>
                 <w:b/>
-                <w:sz w:val="18"/>
+                <w:sz w:val="19"/>
               </w:rPr>
-              <w:t>B  Claims triage and customer assistant (insurer)</w:t>
+              <w:t>2  How you handle these scenarios: why multi-agent; which design pattern; memory strategy; human-in-the-loop boundaries; tool calling strategy; failure handling; cost optimization; observability of agents</w:t>
             </w:r>
           </w:p>
         </w:tc>
         <w:tc>
           <w:tcPr>
-            <w:tcW w:type="dxa" w:w="3061"/>
+            <w:tcW w:type="dxa" w:w="1984"/>
           </w:tcPr>
           <w:p>
             <w:r>
               <w:rPr>
                 <w:b w:val="0"/>
-                <w:sz w:val="18"/>
+                <w:sz w:val="19"/>
               </w:rPr>
-              <w:t>Triage incoming claims (forms, photos, notes), summarise them for adjusters, flag possible fraud, and answer customer status questions.</w:t>
-            </w:r>
-          </w:p>
-        </w:tc>
-        <w:tc>
-          <w:tcPr>
-            <w:tcW w:type="dxa" w:w="2608"/>
-          </w:tcPr>
-          <w:p>
-            <w:r>
-              <w:rPr>
-                <w:b w:val="0"/>
-                <w:sz w:val="18"/>
-              </w:rPr>
-              <w:t>Personal and possibly health data; human review for every adverse decision; peak load after weather events; multiple legacy systems.</w:t>
-            </w:r>
-          </w:p>
-        </w:tc>
-        <w:tc>
-          <w:tcPr>
-            <w:tcW w:type="dxa" w:w="2268"/>
-          </w:tcPr>
-          <w:p>
-            <w:r>
-              <w:rPr>
-                <w:b w:val="0"/>
-                <w:sz w:val="18"/>
-              </w:rPr>
-              <w:t>Cycle time per claim, fraud caught vs false alarms, adjuster hours saved, customer satisfaction.</w:t>
+              <w:t>30%</w:t>
             </w:r>
           </w:p>
         </w:tc>
@@ -265,118 +201,29 @@
         </w:trPr>
         <w:tc>
           <w:tcPr>
-            <w:tcW w:type="dxa" w:w="1928"/>
+            <w:tcW w:type="dxa" w:w="7880"/>
           </w:tcPr>
           <w:p>
             <w:r>
               <w:rPr>
                 <w:b/>
-                <w:sz w:val="18"/>
+                <w:sz w:val="19"/>
               </w:rPr>
-              <w:t>C  Support and retention assistant (retail or telecom)</w:t>
+              <w:t>3  Description of each layer in the diagram and the concept used</w:t>
             </w:r>
           </w:p>
         </w:tc>
         <w:tc>
           <w:tcPr>
-            <w:tcW w:type="dxa" w:w="3061"/>
+            <w:tcW w:type="dxa" w:w="1984"/>
           </w:tcPr>
           <w:p>
             <w:r>
               <w:rPr>
                 <w:b w:val="0"/>
-                <w:sz w:val="18"/>
+                <w:sz w:val="19"/>
               </w:rPr>
-              <w:t>A support assistant that answers from product and policy documents, looks up orders and accounts through tools, and triggers retention offers using a churn model.</w:t>
-            </w:r>
-          </w:p>
-        </w:tc>
-        <w:tc>
-          <w:tcPr>
-            <w:tcW w:type="dxa" w:w="2608"/>
-          </w:tcPr>
-          <w:p>
-            <w:r>
-              <w:rPr>
-                <w:b w:val="0"/>
-                <w:sz w:val="18"/>
-              </w:rPr>
-              <w:t>Seasonal traffic peaks, strict cost per conversation, CRM and ERP integration, offers must follow policy.</w:t>
-            </w:r>
-          </w:p>
-        </w:tc>
-        <w:tc>
-          <w:tcPr>
-            <w:tcW w:type="dxa" w:w="2268"/>
-          </w:tcPr>
-          <w:p>
-            <w:r>
-              <w:rPr>
-                <w:b w:val="0"/>
-                <w:sz w:val="18"/>
-              </w:rPr>
-              <w:t>Resolution rate, cost per contact, churn reduction, escalation rate.</w:t>
-            </w:r>
-          </w:p>
-        </w:tc>
-      </w:tr>
-      <w:tr>
-        <w:trPr>
-          <w:cantSplit w:val="true"/>
-        </w:trPr>
-        <w:tc>
-          <w:tcPr>
-            <w:tcW w:type="dxa" w:w="1928"/>
-          </w:tcPr>
-          <w:p>
-            <w:r>
-              <w:rPr>
-                <w:b/>
-                <w:sz w:val="18"/>
-              </w:rPr>
-              <w:t>D  Your own domain</w:t>
-            </w:r>
-          </w:p>
-        </w:tc>
-        <w:tc>
-          <w:tcPr>
-            <w:tcW w:type="dxa" w:w="3061"/>
-          </w:tcPr>
-          <w:p>
-            <w:r>
-              <w:rPr>
-                <w:b w:val="0"/>
-                <w:sz w:val="18"/>
-              </w:rPr>
-              <w:t>Healthcare, manufacturing, public sector, energy, education or another domain you know. Write 3 lines: problem, data, main constraint.</w:t>
-            </w:r>
-          </w:p>
-        </w:tc>
-        <w:tc>
-          <w:tcPr>
-            <w:tcW w:type="dxa" w:w="2608"/>
-          </w:tcPr>
-          <w:p>
-            <w:r>
-              <w:rPr>
-                <w:b w:val="0"/>
-                <w:sz w:val="18"/>
-              </w:rPr>
-              <w:t>Agree the scenario with the instructor in the first 10 minutes.</w:t>
-            </w:r>
-          </w:p>
-        </w:tc>
-        <w:tc>
-          <w:tcPr>
-            <w:tcW w:type="dxa" w:w="2268"/>
-          </w:tcPr>
-          <w:p>
-            <w:r>
-              <w:rPr>
-                <w:b w:val="0"/>
-                <w:sz w:val="18"/>
-              </w:rPr>
-              <w:t>Define 3 KPIs.</w:t>
+              <w:t>20%</w:t>
             </w:r>
           </w:p>
         </w:tc>
@@ -392,69 +239,7 @@
         <w:pStyle w:val="Heading1"/>
       </w:pPr>
       <w:r>
-        <w:t>Deliverables (one set per team)</w:t>
-      </w:r>
-    </w:p>
-    <w:p>
-      <w:pPr>
-        <w:pStyle w:val="ListBullet"/>
-        <w:spacing w:after="20"/>
-      </w:pPr>
-      <w:r>
-        <w:t>A one-page architecture diagram (boxes and arrows: data, retrieval or models, tools, serving, integration, governance).</w:t>
-      </w:r>
-    </w:p>
-    <w:p>
-      <w:pPr>
-        <w:pStyle w:val="ListBullet"/>
-        <w:spacing w:after="20"/>
-      </w:pPr>
-      <w:r>
-        <w:t>The completed Architecture Canvas (9 sections).</w:t>
-      </w:r>
-    </w:p>
-    <w:p>
-      <w:pPr>
-        <w:pStyle w:val="ListBullet"/>
-        <w:spacing w:after="20"/>
-      </w:pPr>
-      <w:r>
-        <w:t>An evaluation and KPI plan: how you will know it works before and after launch.</w:t>
-      </w:r>
-    </w:p>
-    <w:p>
-      <w:pPr>
-        <w:pStyle w:val="ListBullet"/>
-        <w:spacing w:after="20"/>
-      </w:pPr>
-      <w:r>
-        <w:t>A risk list with mitigations (security, bias, compliance, cost, latency).</w:t>
-      </w:r>
-    </w:p>
-    <w:p>
-      <w:pPr>
-        <w:pStyle w:val="ListBullet"/>
-        <w:spacing w:after="20"/>
-      </w:pPr>
-      <w:r>
-        <w:t>A rough cost and latency estimate, and your MVP scope.</w:t>
-      </w:r>
-    </w:p>
-    <w:p>
-      <w:pPr>
-        <w:pStyle w:val="ListBullet"/>
-        <w:spacing w:after="20"/>
-      </w:pPr>
-      <w:r>
-        <w:t>A short live demo of your assistant (about 2 minutes of your 8).</w:t>
-      </w:r>
-    </w:p>
-    <w:p>
-      <w:pPr>
-        <w:pStyle w:val="Heading1"/>
-      </w:pPr>
-      <w:r>
-        <w:t>Schedule</w:t>
+        <w:t>Suggested use of the 90 minutes</w:t>
       </w:r>
     </w:p>
     <w:tbl>
@@ -519,7 +304,7 @@
                 <w:b/>
                 <w:sz w:val="19"/>
               </w:rPr>
-              <w:t>Milestone 5</w:t>
+              <w:t>10 min</w:t>
             </w:r>
           </w:p>
         </w:tc>
@@ -533,7 +318,7 @@
                 <w:b w:val="0"/>
                 <w:sz w:val="19"/>
               </w:rPr>
-              <w:t>Demo your assistant; adapt the design to your scenario with the canvas; draw the architecture; prepare 5 slides at most</w:t>
+              <w:t>Read the case; split roles; list the layers you need</w:t>
             </w:r>
           </w:p>
         </w:tc>
@@ -552,7 +337,7 @@
                 <w:b/>
                 <w:sz w:val="19"/>
               </w:rPr>
-              <w:t>8 min per team</w:t>
+              <w:t>50 min</w:t>
             </w:r>
           </w:p>
         </w:tc>
@@ -566,7 +351,7 @@
                 <w:b w:val="0"/>
                 <w:sz w:val="19"/>
               </w:rPr>
-              <w:t>Present (1 min problem, 3 min architecture, 2 min trade-offs, 1 min risks, 1 min questions)</w:t>
+              <w:t>Draw the architecture diagram (spend about half your time here)</w:t>
             </w:r>
           </w:p>
         </w:tc>
@@ -585,7 +370,7 @@
                 <w:b/>
                 <w:sz w:val="19"/>
               </w:rPr>
-              <w:t>15 min</w:t>
+              <w:t>30 min</w:t>
             </w:r>
           </w:p>
         </w:tc>
@@ -599,7 +384,7 @@
                 <w:b w:val="0"/>
                 <w:sz w:val="19"/>
               </w:rPr>
-              <w:t>Feedback and discussion</w:t>
+              <w:t>Write the eight scenario answers and the layer descriptions (use the answer template)</w:t>
             </w:r>
           </w:p>
         </w:tc>
@@ -615,260 +400,13 @@
         <w:pStyle w:val="Heading1"/>
       </w:pPr>
       <w:r>
-        <w:t>How you will be scored (100 points)</w:t>
+        <w:t>Presentations</w:t>
       </w:r>
     </w:p>
-    <w:tbl>
-      <w:tblPr>
-        <w:tblStyle w:val="TableGrid"/>
-        <w:tblW w:type="auto" w:w="0"/>
-        <w:tblLayout w:type="fixed"/>
-        <w:tblLook w:firstColumn="1" w:firstRow="1" w:lastColumn="0" w:lastRow="0" w:noHBand="0" w:noVBand="1" w:val="04A0"/>
-      </w:tblPr>
-      <w:tblGrid>
-        <w:gridCol w:w="7880"/>
-        <w:gridCol w:w="1984"/>
-      </w:tblGrid>
-      <w:tr>
-        <w:trPr>
-          <w:cantSplit w:val="true"/>
-        </w:trPr>
-        <w:tc>
-          <w:tcPr>
-            <w:tcW w:type="dxa" w:w="7880"/>
-            <w:shd w:val="clear" w:fill="0E7C86"/>
-          </w:tcPr>
-          <w:p>
-            <w:r>
-              <w:rPr>
-                <w:b/>
-                <w:color w:val="FFFFFF"/>
-                <w:sz w:val="19"/>
-              </w:rPr>
-              <w:t>Criterion</w:t>
-            </w:r>
-          </w:p>
-        </w:tc>
-        <w:tc>
-          <w:tcPr>
-            <w:tcW w:type="dxa" w:w="1984"/>
-            <w:shd w:val="clear" w:fill="0E7C86"/>
-          </w:tcPr>
-          <w:p>
-            <w:r>
-              <w:rPr>
-                <w:b/>
-                <w:color w:val="FFFFFF"/>
-                <w:sz w:val="19"/>
-              </w:rPr>
-              <w:t>Points</w:t>
-            </w:r>
-          </w:p>
-        </w:tc>
-      </w:tr>
-      <w:tr>
-        <w:trPr>
-          <w:cantSplit w:val="true"/>
-        </w:trPr>
-        <w:tc>
-          <w:tcPr>
-            <w:tcW w:type="dxa" w:w="7880"/>
-          </w:tcPr>
-          <w:p>
-            <w:r>
-              <w:rPr>
-                <w:b/>
-                <w:sz w:val="19"/>
-              </w:rPr>
-              <w:t>Fit to the problem and KPIs</w:t>
-            </w:r>
-          </w:p>
-        </w:tc>
-        <w:tc>
-          <w:tcPr>
-            <w:tcW w:type="dxa" w:w="1984"/>
-          </w:tcPr>
-          <w:p>
-            <w:r>
-              <w:rPr>
-                <w:b w:val="0"/>
-                <w:sz w:val="19"/>
-              </w:rPr>
-              <w:t>20</w:t>
-            </w:r>
-          </w:p>
-        </w:tc>
-      </w:tr>
-      <w:tr>
-        <w:trPr>
-          <w:cantSplit w:val="true"/>
-        </w:trPr>
-        <w:tc>
-          <w:tcPr>
-            <w:tcW w:type="dxa" w:w="7880"/>
-          </w:tcPr>
-          <w:p>
-            <w:r>
-              <w:rPr>
-                <w:b/>
-                <w:sz w:val="19"/>
-              </w:rPr>
-              <w:t>Architecture quality and justified choices (rules, ML, RAG, agent, cloud)</w:t>
-            </w:r>
-          </w:p>
-        </w:tc>
-        <w:tc>
-          <w:tcPr>
-            <w:tcW w:type="dxa" w:w="1984"/>
-          </w:tcPr>
-          <w:p>
-            <w:r>
-              <w:rPr>
-                <w:b w:val="0"/>
-                <w:sz w:val="19"/>
-              </w:rPr>
-              <w:t>25</w:t>
-            </w:r>
-          </w:p>
-        </w:tc>
-      </w:tr>
-      <w:tr>
-        <w:trPr>
-          <w:cantSplit w:val="true"/>
-        </w:trPr>
-        <w:tc>
-          <w:tcPr>
-            <w:tcW w:type="dxa" w:w="7880"/>
-          </w:tcPr>
-          <w:p>
-            <w:r>
-              <w:rPr>
-                <w:b/>
-                <w:sz w:val="19"/>
-              </w:rPr>
-              <w:t>Data, retrieval and governance</w:t>
-            </w:r>
-          </w:p>
-        </w:tc>
-        <w:tc>
-          <w:tcPr>
-            <w:tcW w:type="dxa" w:w="1984"/>
-          </w:tcPr>
-          <w:p>
-            <w:r>
-              <w:rPr>
-                <w:b w:val="0"/>
-                <w:sz w:val="19"/>
-              </w:rPr>
-              <w:t>15</w:t>
-            </w:r>
-          </w:p>
-        </w:tc>
-      </w:tr>
-      <w:tr>
-        <w:trPr>
-          <w:cantSplit w:val="true"/>
-        </w:trPr>
-        <w:tc>
-          <w:tcPr>
-            <w:tcW w:type="dxa" w:w="7880"/>
-          </w:tcPr>
-          <w:p>
-            <w:r>
-              <w:rPr>
-                <w:b/>
-                <w:sz w:val="19"/>
-              </w:rPr>
-              <w:t>Evaluation and operations (testing, monitoring, release)</w:t>
-            </w:r>
-          </w:p>
-        </w:tc>
-        <w:tc>
-          <w:tcPr>
-            <w:tcW w:type="dxa" w:w="1984"/>
-          </w:tcPr>
-          <w:p>
-            <w:r>
-              <w:rPr>
-                <w:b w:val="0"/>
-                <w:sz w:val="19"/>
-              </w:rPr>
-              <w:t>15</w:t>
-            </w:r>
-          </w:p>
-        </w:tc>
-      </w:tr>
-      <w:tr>
-        <w:trPr>
-          <w:cantSplit w:val="true"/>
-        </w:trPr>
-        <w:tc>
-          <w:tcPr>
-            <w:tcW w:type="dxa" w:w="7880"/>
-          </w:tcPr>
-          <w:p>
-            <w:r>
-              <w:rPr>
-                <w:b/>
-                <w:sz w:val="19"/>
-              </w:rPr>
-              <w:t>Responsible AI, security and compliance</w:t>
-            </w:r>
-          </w:p>
-        </w:tc>
-        <w:tc>
-          <w:tcPr>
-            <w:tcW w:type="dxa" w:w="1984"/>
-          </w:tcPr>
-          <w:p>
-            <w:r>
-              <w:rPr>
-                <w:b w:val="0"/>
-                <w:sz w:val="19"/>
-              </w:rPr>
-              <w:t>15</w:t>
-            </w:r>
-          </w:p>
-        </w:tc>
-      </w:tr>
-      <w:tr>
-        <w:trPr>
-          <w:cantSplit w:val="true"/>
-        </w:trPr>
-        <w:tc>
-          <w:tcPr>
-            <w:tcW w:type="dxa" w:w="7880"/>
-          </w:tcPr>
-          <w:p>
-            <w:r>
-              <w:rPr>
-                <w:b/>
-                <w:sz w:val="19"/>
-              </w:rPr>
-              <w:t>Clarity and defence of trade-offs</w:t>
-            </w:r>
-          </w:p>
-        </w:tc>
-        <w:tc>
-          <w:tcPr>
-            <w:tcW w:type="dxa" w:w="1984"/>
-          </w:tcPr>
-          <w:p>
-            <w:r>
-              <w:rPr>
-                <w:b w:val="0"/>
-                <w:sz w:val="19"/>
-              </w:rPr>
-              <w:t>10</w:t>
-            </w:r>
-          </w:p>
-        </w:tc>
-      </w:tr>
-    </w:tbl>
     <w:p>
-      <w:pPr>
-        <w:spacing w:after="40"/>
-      </w:pPr>
+      <w:r>
+        <w:t>After the break, each team presents for about 8 minutes: the diagram, the key trade-offs, and your answers to the eight questions.</w:t>
+      </w:r>
     </w:p>
     <w:p>
       <w:pPr>
@@ -884,25 +422,7 @@
         <w:spacing w:after="20"/>
       </w:pPr>
       <w:r>
-        <w:t>Use synthetic or public information only. Do not use real client data.</w:t>
-      </w:r>
-    </w:p>
-    <w:p>
-      <w:pPr>
-        <w:pStyle w:val="ListBullet"/>
-        <w:spacing w:after="20"/>
-      </w:pPr>
-      <w:r>
-        <w:t>You may use any free cloud or open-source tools; name services in plain terms and note that names change.</w:t>
-      </w:r>
-    </w:p>
-    <w:p>
-      <w:pPr>
-        <w:pStyle w:val="ListBullet"/>
-        <w:spacing w:after="20"/>
-      </w:pPr>
-      <w:r>
-        <w:t>The demo uses your milestone notebooks; keep it short.</w:t>
+        <w:t>Use plain technology names and say why you chose them (any framework or cloud is fine).</w:t>
       </w:r>
     </w:p>
     <w:p>
@@ -912,6 +432,24 @@
       </w:pPr>
       <w:r>
         <w:t>Every choice needs a reason: say what you rejected and why.</w:t>
+      </w:r>
+    </w:p>
+    <w:p>
+      <w:pPr>
+        <w:pStyle w:val="ListBullet"/>
+        <w:spacing w:after="20"/>
+      </w:pPr>
+      <w:r>
+        <w:t>Use what you built this week: tools, MCP, memory, RAG, monitoring, guardrails.</w:t>
+      </w:r>
+    </w:p>
+    <w:p>
+      <w:pPr>
+        <w:pStyle w:val="ListBullet"/>
+        <w:spacing w:after="20"/>
+      </w:pPr>
+      <w:r>
+        <w:t>Use synthetic or public information only.</w:t>
       </w:r>
     </w:p>
     <w:sectPr>
@@ -936,7 +474,7 @@
       <w:rPr>
         <w:sz w:val="16"/>
       </w:rPr>
-      <w:t xml:space="preserve">Capstone brief  |  Nagarjuna Naidu  |  page </w:t>
+      <w:t xml:space="preserve">Capstone: Day 5 case study  |  Nagarjuna Naidu  |  page </w:t>
     </w:r>
     <w:r>
       <w:rPr>

</xml_diff>